<commit_message>
Exercice 2 : figures redessinées proprement
Co-Authored-By: Claude Opus 5.5 <noreply@anthropic.com>
Claude-Session: https://claude.ai/code/session_0127Ko1ZzjqSKTcZdUV9PPY2
</commit_message>
<xml_diff>
--- a/Exercice2_ultrasons_huile_olive.docx
+++ b/Exercice2_ultrasons_huile_olive.docx
@@ -102,7 +102,7 @@
       <w:r>
         <w:drawing>
           <wp:inline distT="0" distB="0" distL="0" distR="0">
-            <wp:extent cx="3771900" cy="2667000"/>
+            <wp:extent cx="4381500" cy="2590800"/>
             <wp:effectExtent t="0" r="0" b="0" l="0"/>
             <wp:docPr id="1" name="" descr="" title=""/>
             <wp:cNvGraphicFramePr>
@@ -127,7 +127,7 @@
                   <pic:spPr bwMode="auto">
                     <a:xfrm>
                       <a:off x="0" y="0"/>
-                      <a:ext cx="3771900" cy="2667000"/>
+                      <a:ext cx="4381500" cy="2590800"/>
                     </a:xfrm>
                     <a:prstGeom prst="rect">
                       <a:avLst/>
@@ -191,7 +191,7 @@
       <w:r>
         <w:drawing>
           <wp:inline distT="0" distB="0" distL="0" distR="0">
-            <wp:extent cx="4000500" cy="2952750"/>
+            <wp:extent cx="3810000" cy="2752725"/>
             <wp:effectExtent t="0" r="0" b="0" l="0"/>
             <wp:docPr id="1" name="" descr="" title=""/>
             <wp:cNvGraphicFramePr>
@@ -216,7 +216,7 @@
                   <pic:spPr bwMode="auto">
                     <a:xfrm>
                       <a:off x="0" y="0"/>
-                      <a:ext cx="4000500" cy="2952750"/>
+                      <a:ext cx="3810000" cy="2752725"/>
                     </a:xfrm>
                     <a:prstGeom prst="rect">
                       <a:avLst/>
@@ -476,7 +476,7 @@
   <w:docDefaults>
     <w:rPrDefault>
       <w:rPr>
-        <w:rFonts w:ascii="Calibri" w:cs="Calibri" w:eastAsia="Calibri" w:hAnsi="Calibri"/>
+        <w:rFonts w:ascii="Cambria" w:cs="Cambria" w:eastAsia="Cambria" w:hAnsi="Cambria"/>
         <w:sz w:val="24"/>
         <w:szCs w:val="24"/>
       </w:rPr>

</xml_diff>

<commit_message>
Exercice 2 : ajout des questions 2 à 5
Co-Authored-By: Claude Opus 5.5 <noreply@anthropic.com>
Claude-Session: https://claude.ai/code/session_0127Ko1ZzjqSKTcZdUV9PPY2
</commit_message>
<xml_diff>
--- a/Exercice2_ultrasons_huile_olive.docx
+++ b/Exercice2_ultrasons_huile_olive.docx
@@ -246,28 +246,276 @@
     </w:p>
     <w:p>
       <w:pPr>
-        <w:pStyle w:val="ListParagraph"/>
-        <w:numPr>
-          <w:ilvl w:val="0"/>
-          <w:numId w:val="2"/>
-        </w:numPr>
-        <w:spacing w:after="120"/>
-      </w:pPr>
-      <w:r>
-        <w:t xml:space="preserve">Les ultrasons sont-elles des ondes longitudinales ou transversales ? Justifier.</w:t>
-      </w:r>
-    </w:p>
-    <w:p>
-      <w:pPr>
-        <w:pStyle w:val="ListParagraph"/>
-        <w:numPr>
-          <w:ilvl w:val="0"/>
-          <w:numId w:val="2"/>
-        </w:numPr>
-        <w:spacing w:after="120"/>
-      </w:pPr>
-      <w:r>
-        <w:t xml:space="preserve">Les ultrasons utilisés dans l’expérience précédente …</w:t>
+        <w:spacing w:after="140" w:line="300"/>
+        <w:ind w:left="500" w:hanging="400"/>
+        <w:jc w:val="both"/>
+      </w:pPr>
+      <w:r>
+        <w:rPr>
+          <w:b/>
+          <w:bCs/>
+        </w:rPr>
+        <w:t xml:space="preserve">1/	</w:t>
+      </w:r>
+      <w:r>
+        <w:t xml:space="preserve">Les ultrasons sont-ils des ondes longitudinales ou transversales ? Justifier.</w:t>
+      </w:r>
+    </w:p>
+    <w:p>
+      <w:pPr>
+        <w:spacing w:after="140" w:line="300"/>
+        <w:ind w:left="500" w:hanging="400"/>
+        <w:jc w:val="both"/>
+      </w:pPr>
+      <w:r>
+        <w:rPr>
+          <w:b/>
+          <w:bCs/>
+        </w:rPr>
+        <w:t xml:space="preserve">2/	</w:t>
+      </w:r>
+      <w:r>
+        <w:t xml:space="preserve">Les ultrasons utilisés dans l’expérience précédente ont une fréquence </w:t>
+      </w:r>
+      <w:r>
+        <w:rPr>
+          <w:b/>
+          <w:bCs/>
+        </w:rPr>
+        <w:t xml:space="preserve">N = 40 kHz</w:t>
+      </w:r>
+      <w:r>
+        <w:t xml:space="preserve"> ; leur célérité dans l’air est </w:t>
+      </w:r>
+      <w:r>
+        <w:rPr>
+          <w:b/>
+          <w:bCs/>
+        </w:rPr>
+        <w:t xml:space="preserve">v</w:t>
+      </w:r>
+      <w:r>
+        <w:rPr>
+          <w:b/>
+          <w:bCs/>
+          <w:vertAlign w:val="subscript"/>
+        </w:rPr>
+        <w:t xml:space="preserve">a</w:t>
+      </w:r>
+      <w:r>
+        <w:rPr>
+          <w:b/>
+          <w:bCs/>
+        </w:rPr>
+        <w:t xml:space="preserve"> = 340 m/s</w:t>
+      </w:r>
+      <w:r>
+        <w:t xml:space="preserve">. Calculer la distance parcourue par ces ultrasons dans l’air pendant une période.</w:t>
+      </w:r>
+    </w:p>
+    <w:p>
+      <w:pPr>
+        <w:spacing w:after="140" w:line="300"/>
+        <w:ind w:left="500" w:hanging="400"/>
+        <w:jc w:val="both"/>
+      </w:pPr>
+      <w:r>
+        <w:rPr>
+          <w:b/>
+          <w:bCs/>
+        </w:rPr>
+        <w:t xml:space="preserve">3/	</w:t>
+      </w:r>
+      <w:r>
+        <w:t xml:space="preserve">Exprimer Δt en fonction de D, v</w:t>
+      </w:r>
+      <w:r>
+        <w:rPr>
+          <w:vertAlign w:val="subscript"/>
+        </w:rPr>
+        <w:t xml:space="preserve">h</w:t>
+      </w:r>
+      <w:r>
+        <w:t xml:space="preserve"> et v</w:t>
+      </w:r>
+      <w:r>
+        <w:rPr>
+          <w:vertAlign w:val="subscript"/>
+        </w:rPr>
+        <w:t xml:space="preserve">a</w:t>
+      </w:r>
+      <w:r>
+        <w:t xml:space="preserve">.</w:t>
+      </w:r>
+    </w:p>
+    <w:p>
+      <w:pPr>
+        <w:spacing w:after="140" w:line="300"/>
+        <w:ind w:left="500" w:hanging="400"/>
+        <w:jc w:val="both"/>
+      </w:pPr>
+      <w:r>
+        <w:rPr>
+          <w:b/>
+          <w:bCs/>
+        </w:rPr>
+        <w:t xml:space="preserve">4/	</w:t>
+      </w:r>
+      <w:r>
+        <w:t xml:space="preserve">L’huile testée est-elle pure ? Justifier.</w:t>
+      </w:r>
+    </w:p>
+    <w:p>
+      <w:pPr>
+        <w:spacing w:after="140" w:line="300"/>
+        <w:ind w:left="500" w:hanging="400"/>
+        <w:jc w:val="both"/>
+      </w:pPr>
+      <w:r>
+        <w:rPr>
+          <w:b/>
+          <w:bCs/>
+        </w:rPr>
+        <w:t xml:space="preserve">5/	</w:t>
+      </w:r>
+      <w:r>
+        <w:t xml:space="preserve">On introduit entre l’émetteur E et le récepteur A une plaque métallique d’épaisseur </w:t>
+      </w:r>
+      <w:r>
+        <w:rPr>
+          <w:i/>
+          <w:iCs/>
+        </w:rPr>
+        <w:t xml:space="preserve">e</w:t>
+      </w:r>
+      <w:r>
+        <w:t xml:space="preserve">.</w:t>
+      </w:r>
+    </w:p>
+    <w:p>
+      <w:pPr>
+        <w:spacing w:after="140" w:line="300"/>
+        <w:ind w:left="1100" w:hanging="600"/>
+        <w:jc w:val="both"/>
+      </w:pPr>
+      <w:r>
+        <w:rPr>
+          <w:b/>
+          <w:bCs/>
+        </w:rPr>
+        <w:t xml:space="preserve">5-1/	</w:t>
+      </w:r>
+      <w:r>
+        <w:t xml:space="preserve">Comparer le retard temporel τ entre les deux ondes reçues par A et B avant l’introduction de la plaque métallique, et le retard temporel τ’ après son introduction.</w:t>
+      </w:r>
+    </w:p>
+    <w:p>
+      <w:pPr>
+        <w:spacing w:after="140" w:line="300"/>
+        <w:ind w:left="1100" w:hanging="600"/>
+        <w:jc w:val="both"/>
+      </w:pPr>
+      <w:r>
+        <w:rPr>
+          <w:b/>
+          <w:bCs/>
+        </w:rPr>
+        <w:t xml:space="preserve">5-2/	</w:t>
+      </w:r>
+      <w:r>
+        <w:t xml:space="preserve">Sachant qu’après l’introduction de la plaque métallique, les deux ondes sont captées par A et B au même instant, déduire la valeur du retard temporel τ’.</w:t>
+      </w:r>
+    </w:p>
+    <w:p>
+      <w:pPr>
+        <w:spacing w:after="140" w:line="300"/>
+        <w:ind w:left="1100" w:hanging="600"/>
+        <w:jc w:val="both"/>
+      </w:pPr>
+      <w:r>
+        <w:rPr>
+          <w:b/>
+          <w:bCs/>
+        </w:rPr>
+        <w:t xml:space="preserve">5-3/	</w:t>
+      </w:r>
+      <w:r>
+        <w:t xml:space="preserve">Montrer que l’expression de l’épaisseur </w:t>
+      </w:r>
+      <w:r>
+        <w:rPr>
+          <w:i/>
+          <w:iCs/>
+        </w:rPr>
+        <w:t xml:space="preserve">e</w:t>
+      </w:r>
+      <w:r>
+        <w:t xml:space="preserve"> de la plaque métallique s’écrit :</w:t>
+      </w:r>
+    </w:p>
+    <w:p>
+      <w:pPr>
+        <w:spacing w:after="200" w:before="200"/>
+        <w:jc w:val="center"/>
+      </w:pPr>
+      <w:r>
+        <w:drawing>
+          <wp:inline distT="0" distB="0" distL="0" distR="0">
+            <wp:extent cx="1847850" cy="1419225"/>
+            <wp:effectExtent t="0" r="0" b="0" l="0"/>
+            <wp:docPr id="1" name="" descr="" title=""/>
+            <wp:cNvGraphicFramePr>
+              <a:graphicFrameLocks xmlns:a="http://schemas.openxmlformats.org/drawingml/2006/main" noChangeAspect="1"/>
+            </wp:cNvGraphicFramePr>
+            <a:graphic xmlns:a="http://schemas.openxmlformats.org/drawingml/2006/main">
+              <a:graphicData uri="http://schemas.openxmlformats.org/drawingml/2006/picture">
+                <pic:pic xmlns:pic="http://schemas.openxmlformats.org/drawingml/2006/picture">
+                  <pic:nvPicPr>
+                    <pic:cNvPr id="0" name="" descr=""/>
+                    <pic:cNvPicPr>
+                      <a:picLocks noChangeAspect="1" noChangeArrowheads="1"/>
+                    </pic:cNvPicPr>
+                  </pic:nvPicPr>
+                  <pic:blipFill>
+                    <a:blip r:embed="rId9" cstate="none"/>
+                    <a:srcRect/>
+                    <a:stretch>
+                      <a:fillRect/>
+                    </a:stretch>
+                  </pic:blipFill>
+                  <pic:spPr bwMode="auto">
+                    <a:xfrm>
+                      <a:off x="0" y="0"/>
+                      <a:ext cx="1847850" cy="1419225"/>
+                    </a:xfrm>
+                    <a:prstGeom prst="rect">
+                      <a:avLst/>
+                    </a:prstGeom>
+                  </pic:spPr>
+                </pic:pic>
+              </a:graphicData>
+            </a:graphic>
+          </wp:inline>
+        </w:drawing>
+      </w:r>
+    </w:p>
+    <w:p>
+      <w:pPr>
+        <w:spacing w:after="120" w:line="300"/>
+        <w:ind w:left="1100"/>
+        <w:jc w:val="both"/>
+      </w:pPr>
+      <w:r>
+        <w:t xml:space="preserve">avec v</w:t>
+      </w:r>
+      <w:r>
+        <w:rPr>
+          <w:vertAlign w:val="subscript"/>
+        </w:rPr>
+        <w:t xml:space="preserve">m</w:t>
+      </w:r>
+      <w:r>
+        <w:t xml:space="preserve"> la célérité de propagation de l’onde ultrasonore dans le métal.</w:t>
       </w:r>
     </w:p>
     <w:sectPr>
@@ -458,12 +706,6 @@
   </w:abstractNum>
   <w:num w:numId="1">
     <w:abstractNumId w:val="1"/>
-    <w:lvlOverride w:ilvl="0">
-      <w:startOverride w:val="1"/>
-    </w:lvlOverride>
-  </w:num>
-  <w:num w:numId="2">
-    <w:abstractNumId w:val="2"/>
     <w:lvlOverride w:ilvl="0">
       <w:startOverride w:val="1"/>
     </w:lvlOverride>

</xml_diff>

<commit_message>
Exercice 2 : formule écrite en équation Word (éditable)
Co-Authored-By: Claude Opus 5.5 <noreply@anthropic.com>
Claude-Session: https://claude.ai/code/session_0127Ko1ZzjqSKTcZdUV9PPY2
</commit_message>
<xml_diff>
--- a/Exercice2_ultrasons_huile_olive.docx
+++ b/Exercice2_ultrasons_huile_olive.docx
@@ -455,49 +455,97 @@
     </w:p>
     <w:p>
       <w:pPr>
+        <w:pBdr>
+          <w:top w:val="single" w:color="C00000" w:sz="12" w:space="8"/>
+          <w:bottom w:val="single" w:color="C00000" w:sz="12" w:space="8"/>
+          <w:left w:val="single" w:color="C00000" w:sz="12" w:space="8"/>
+          <w:right w:val="single" w:color="C00000" w:sz="12" w:space="8"/>
+        </w:pBdr>
         <w:spacing w:after="200" w:before="200"/>
+        <w:ind w:left="3200" w:right="3200"/>
         <w:jc w:val="center"/>
       </w:pPr>
-      <w:r>
-        <w:drawing>
-          <wp:inline distT="0" distB="0" distL="0" distR="0">
-            <wp:extent cx="1847850" cy="1419225"/>
-            <wp:effectExtent t="0" r="0" b="0" l="0"/>
-            <wp:docPr id="1" name="" descr="" title=""/>
-            <wp:cNvGraphicFramePr>
-              <a:graphicFrameLocks xmlns:a="http://schemas.openxmlformats.org/drawingml/2006/main" noChangeAspect="1"/>
-            </wp:cNvGraphicFramePr>
-            <a:graphic xmlns:a="http://schemas.openxmlformats.org/drawingml/2006/main">
-              <a:graphicData uri="http://schemas.openxmlformats.org/drawingml/2006/picture">
-                <pic:pic xmlns:pic="http://schemas.openxmlformats.org/drawingml/2006/picture">
-                  <pic:nvPicPr>
-                    <pic:cNvPr id="0" name="" descr=""/>
-                    <pic:cNvPicPr>
-                      <a:picLocks noChangeAspect="1" noChangeArrowheads="1"/>
-                    </pic:cNvPicPr>
-                  </pic:nvPicPr>
-                  <pic:blipFill>
-                    <a:blip r:embed="rId9" cstate="none"/>
-                    <a:srcRect/>
-                    <a:stretch>
-                      <a:fillRect/>
-                    </a:stretch>
-                  </pic:blipFill>
-                  <pic:spPr bwMode="auto">
-                    <a:xfrm>
-                      <a:off x="0" y="0"/>
-                      <a:ext cx="1847850" cy="1419225"/>
-                    </a:xfrm>
-                    <a:prstGeom prst="rect">
-                      <a:avLst/>
-                    </a:prstGeom>
-                  </pic:spPr>
-                </pic:pic>
-              </a:graphicData>
-            </a:graphic>
-          </wp:inline>
-        </w:drawing>
-      </w:r>
+      <m:oMath>
+        <m:r>
+          <m:t>e=D∙</m:t>
+        </m:r>
+        <m:f>
+          <m:num>
+            <m:r>
+              <m:t>1−</m:t>
+            </m:r>
+            <m:f>
+              <m:num>
+                <m:sSub>
+                  <m:sSubPr/>
+                  <m:e>
+                    <m:r>
+                      <m:t>v</m:t>
+                    </m:r>
+                  </m:e>
+                  <m:sub>
+                    <m:r>
+                      <m:t>a</m:t>
+                    </m:r>
+                  </m:sub>
+                </m:sSub>
+              </m:num>
+              <m:den>
+                <m:sSub>
+                  <m:sSubPr/>
+                  <m:e>
+                    <m:r>
+                      <m:t>v</m:t>
+                    </m:r>
+                  </m:e>
+                  <m:sub>
+                    <m:r>
+                      <m:t>h</m:t>
+                    </m:r>
+                  </m:sub>
+                </m:sSub>
+              </m:den>
+            </m:f>
+          </m:num>
+          <m:den>
+            <m:r>
+              <m:t>1−</m:t>
+            </m:r>
+            <m:f>
+              <m:num>
+                <m:sSub>
+                  <m:sSubPr/>
+                  <m:e>
+                    <m:r>
+                      <m:t>v</m:t>
+                    </m:r>
+                  </m:e>
+                  <m:sub>
+                    <m:r>
+                      <m:t>a</m:t>
+                    </m:r>
+                  </m:sub>
+                </m:sSub>
+              </m:num>
+              <m:den>
+                <m:sSub>
+                  <m:sSubPr/>
+                  <m:e>
+                    <m:r>
+                      <m:t>v</m:t>
+                    </m:r>
+                  </m:e>
+                  <m:sub>
+                    <m:r>
+                      <m:t>m</m:t>
+                    </m:r>
+                  </m:sub>
+                </m:sSub>
+              </m:den>
+            </m:f>
+          </m:den>
+        </m:f>
+      </m:oMath>
     </w:p>
     <w:p>
       <w:pPr>

</xml_diff>